<commit_message>
BwST lab1-4 plus templates
</commit_message>
<xml_diff>
--- a/Cybersecurity/Semestr_II/BwST/LAB1/Trojan_Wilk_Zmiendak_LAB1.docx
+++ b/Cybersecurity/Semestr_II/BwST/LAB1/Trojan_Wilk_Zmiendak_LAB1.docx
@@ -593,11 +593,7 @@
           </mc:Choice>
           <mc:Fallback>
             <w:pict>
-              <v:shapetype w14:anchorId="272D62BA" id="_x0000_t202" coordsize="21600,21600" o:spt="202" path="m,l,21600r21600,l21600,xe">
-                <v:stroke joinstyle="miter"/>
-                <v:path gradientshapeok="t" o:connecttype="rect"/>
-              </v:shapetype>
-              <v:shape id="Pole tekstowe 16" o:spid="_x0000_s1028" type="#_x0000_t202" style="position:absolute;margin-left:61.75pt;margin-top:14.45pt;width:329.25pt;height:89.4pt;z-index:251661312;visibility:visible;mso-wrap-style:square;mso-width-percent:0;mso-height-percent:0;mso-wrap-distance-left:9pt;mso-wrap-distance-top:0;mso-wrap-distance-right:9pt;mso-wrap-distance-bottom:0;mso-position-horizontal:absolute;mso-position-horizontal-relative:margin;mso-position-vertical:absolute;mso-position-vertical-relative:text;mso-width-percent:0;mso-height-percent:0;mso-width-relative:margin;mso-height-relative:margin;v-text-anchor:top" o:gfxdata="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" stroked="f">
+              <v:shape w14:anchorId="272D62BA" id="Pole tekstowe 16" o:spid="_x0000_s1028" type="#_x0000_t202" style="position:absolute;margin-left:61.75pt;margin-top:14.45pt;width:329.25pt;height:89.4pt;z-index:251661312;visibility:visible;mso-wrap-style:square;mso-width-percent:0;mso-height-percent:0;mso-wrap-distance-left:9pt;mso-wrap-distance-top:0;mso-wrap-distance-right:9pt;mso-wrap-distance-bottom:0;mso-position-horizontal:absolute;mso-position-horizontal-relative:margin;mso-position-vertical:absolute;mso-position-vertical-relative:text;mso-width-percent:0;mso-height-percent:0;mso-width-relative:margin;mso-height-relative:margin;v-text-anchor:top" o:gfxdata="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" stroked="f">
                 <v:textbox>
                   <w:txbxContent>
                     <w:p>
@@ -931,13 +927,64 @@
       <w:pPr>
         <w:rPr>
           <w:rFonts w:ascii="Arial" w:hAnsi="Arial" w:cs="Arial"/>
+          <w:sz w:val="28"/>
+          <w:szCs w:val="28"/>
+        </w:rPr>
+      </w:pPr>
+      <w:r>
+        <w:rPr>
+          <w:rFonts w:ascii="Arial" w:hAnsi="Arial" w:cs="Arial"/>
           <w:b/>
           <w:bCs/>
           <w:sz w:val="32"/>
           <w:szCs w:val="32"/>
         </w:rPr>
+        <w:t>Wstęp Teoretyczny</w:t>
+      </w:r>
+    </w:p>
+    <w:p>
+      <w:pPr>
+        <w:rPr>
+          <w:rFonts w:ascii="Arial" w:hAnsi="Arial" w:cs="Arial"/>
+          <w:sz w:val="28"/>
+          <w:szCs w:val="28"/>
+        </w:rPr>
       </w:pPr>
       <w:r>
+        <w:rPr>
+          <w:rFonts w:ascii="Arial" w:hAnsi="Arial" w:cs="Arial"/>
+          <w:sz w:val="28"/>
+          <w:szCs w:val="28"/>
+        </w:rPr>
+        <w:t xml:space="preserve">Celem laboratorium jest skonfigurowanie i przetestowanie </w:t>
+      </w:r>
+      <w:r>
+        <w:rPr>
+          <w:rFonts w:ascii="Arial" w:hAnsi="Arial" w:cs="Arial"/>
+          <w:sz w:val="28"/>
+          <w:szCs w:val="28"/>
+        </w:rPr>
+        <w:t>maszyn wirtualn</w:t>
+      </w:r>
+      <w:r>
+        <w:rPr>
+          <w:rFonts w:ascii="Arial" w:hAnsi="Arial" w:cs="Arial"/>
+          <w:sz w:val="28"/>
+          <w:szCs w:val="28"/>
+        </w:rPr>
+        <w:t>ych potrzebnych do wykonania tych oraz kolejnych zadań laboratoryjnych</w:t>
+      </w:r>
+      <w:r>
+        <w:rPr>
+          <w:rFonts w:ascii="Arial" w:hAnsi="Arial" w:cs="Arial"/>
+          <w:sz w:val="28"/>
+          <w:szCs w:val="28"/>
+        </w:rPr>
+        <w:t>.</w:t>
+      </w:r>
+    </w:p>
+    <w:p>
+      <w:pPr>
         <w:rPr>
           <w:rFonts w:ascii="Arial" w:hAnsi="Arial" w:cs="Arial"/>
           <w:b/>
@@ -945,11 +992,8 @@
           <w:sz w:val="32"/>
           <w:szCs w:val="32"/>
         </w:rPr>
-        <w:t>Wstęp Teoretyczny</w:t>
-      </w:r>
-    </w:p>
-    <w:p>
-      <w:pPr>
+      </w:pPr>
+      <w:r>
         <w:rPr>
           <w:rFonts w:ascii="Arial" w:hAnsi="Arial" w:cs="Arial"/>
           <w:b/>
@@ -957,15 +1001,6 @@
           <w:sz w:val="32"/>
           <w:szCs w:val="32"/>
         </w:rPr>
-      </w:pPr>
-      <w:r>
-        <w:rPr>
-          <w:rFonts w:ascii="Arial" w:hAnsi="Arial" w:cs="Arial"/>
-          <w:b/>
-          <w:bCs/>
-          <w:sz w:val="32"/>
-          <w:szCs w:val="32"/>
-        </w:rPr>
         <w:t>Zadania Laboratoryjne</w:t>
       </w:r>
     </w:p>
@@ -973,10 +1008,121 @@
       <w:pPr>
         <w:rPr>
           <w:rFonts w:ascii="Arial" w:hAnsi="Arial" w:cs="Arial"/>
+          <w:sz w:val="28"/>
+          <w:szCs w:val="28"/>
+        </w:rPr>
+      </w:pPr>
+      <w:r>
+        <w:rPr>
+          <w:rFonts w:ascii="Arial" w:hAnsi="Arial" w:cs="Arial"/>
+          <w:sz w:val="28"/>
+          <w:szCs w:val="28"/>
+        </w:rPr>
+        <w:t>Maszyny wirtualne zostały skonfigurowane w środowisku VirtualBox:</w:t>
+      </w:r>
+    </w:p>
+    <w:p>
+      <w:pPr>
+        <w:rPr>
+          <w:rFonts w:ascii="Arial" w:hAnsi="Arial" w:cs="Arial"/>
+          <w:sz w:val="28"/>
+          <w:szCs w:val="28"/>
+        </w:rPr>
+      </w:pPr>
+      <w:r>
+        <w:rPr>
+          <w:rFonts w:ascii="Arial" w:hAnsi="Arial" w:cs="Arial"/>
+          <w:noProof/>
+          <w:sz w:val="28"/>
+          <w:szCs w:val="28"/>
+        </w:rPr>
+        <w:drawing>
+          <wp:inline distT="0" distB="0" distL="0" distR="0" wp14:anchorId="1039C2A9" wp14:editId="5B9CD71A">
+            <wp:extent cx="2073963" cy="2796540"/>
+            <wp:effectExtent l="0" t="0" r="2540" b="3810"/>
+            <wp:docPr id="1133189560" name="Obraz 1"/>
+            <wp:cNvGraphicFramePr>
+              <a:graphicFrameLocks xmlns:a="http://schemas.openxmlformats.org/drawingml/2006/main" noChangeAspect="1"/>
+            </wp:cNvGraphicFramePr>
+            <a:graphic xmlns:a="http://schemas.openxmlformats.org/drawingml/2006/main">
+              <a:graphicData uri="http://schemas.openxmlformats.org/drawingml/2006/picture">
+                <pic:pic xmlns:pic="http://schemas.openxmlformats.org/drawingml/2006/picture">
+                  <pic:nvPicPr>
+                    <pic:cNvPr id="1133189560" name=""/>
+                    <pic:cNvPicPr/>
+                  </pic:nvPicPr>
+                  <pic:blipFill>
+                    <a:blip r:embed="rId6"/>
+                    <a:stretch>
+                      <a:fillRect/>
+                    </a:stretch>
+                  </pic:blipFill>
+                  <pic:spPr>
+                    <a:xfrm>
+                      <a:off x="0" y="0"/>
+                      <a:ext cx="2085123" cy="2811589"/>
+                    </a:xfrm>
+                    <a:prstGeom prst="rect">
+                      <a:avLst/>
+                    </a:prstGeom>
+                  </pic:spPr>
+                </pic:pic>
+              </a:graphicData>
+            </a:graphic>
+          </wp:inline>
+        </w:drawing>
+      </w:r>
+    </w:p>
+    <w:p>
+      <w:pPr>
+        <w:rPr>
+          <w:rFonts w:ascii="Arial" w:hAnsi="Arial" w:cs="Arial"/>
+          <w:sz w:val="28"/>
+          <w:szCs w:val="28"/>
+        </w:rPr>
+      </w:pPr>
+      <w:r>
+        <w:rPr>
+          <w:rFonts w:ascii="Arial" w:hAnsi="Arial" w:cs="Arial"/>
+          <w:sz w:val="28"/>
+          <w:szCs w:val="28"/>
+        </w:rPr>
+        <w:lastRenderedPageBreak/>
+        <w:t xml:space="preserve">W celu zweryfikowania ich poprawnego działania </w:t>
+      </w:r>
+      <w:r>
+        <w:rPr>
+          <w:rFonts w:ascii="Arial" w:hAnsi="Arial" w:cs="Arial"/>
+          <w:sz w:val="28"/>
+          <w:szCs w:val="28"/>
+        </w:rPr>
+        <w:t>s</w:t>
+      </w:r>
+      <w:r>
+        <w:rPr>
+          <w:rFonts w:ascii="Arial" w:hAnsi="Arial" w:cs="Arial"/>
+          <w:sz w:val="28"/>
+          <w:szCs w:val="28"/>
+        </w:rPr>
+        <w:t>prawdzamy adresację ich interfaców oraz wykonujemy test komunikacyjny przy pomocy protokołu PING.</w:t>
+      </w:r>
+      <w:r>
+        <w:rPr>
+          <w:rFonts w:ascii="Arial" w:hAnsi="Arial" w:cs="Arial"/>
+          <w:sz w:val="28"/>
+          <w:szCs w:val="28"/>
+        </w:rPr>
+        <w:t xml:space="preserve"> </w:t>
+      </w:r>
+    </w:p>
+    <w:p>
+      <w:pPr>
+        <w:rPr>
+          <w:rFonts w:ascii="Arial" w:hAnsi="Arial" w:cs="Arial"/>
           <w:b/>
           <w:bCs/>
-          <w:sz w:val="32"/>
-          <w:szCs w:val="32"/>
+          <w:sz w:val="28"/>
+          <w:szCs w:val="28"/>
         </w:rPr>
       </w:pPr>
       <w:r>
@@ -984,11 +1130,379 @@
           <w:rFonts w:ascii="Arial" w:hAnsi="Arial" w:cs="Arial"/>
           <w:b/>
           <w:bCs/>
-          <w:sz w:val="32"/>
-          <w:szCs w:val="32"/>
-        </w:rPr>
-        <w:t>Podsumowanie</w:t>
-      </w:r>
+          <w:sz w:val="28"/>
+          <w:szCs w:val="28"/>
+        </w:rPr>
+        <w:t>Adresacja:</w:t>
+      </w:r>
+    </w:p>
+    <w:p>
+      <w:pPr>
+        <w:rPr>
+          <w:rFonts w:ascii="Arial" w:hAnsi="Arial" w:cs="Arial"/>
+          <w:i/>
+          <w:iCs/>
+          <w:sz w:val="28"/>
+          <w:szCs w:val="28"/>
+          <w:lang w:val="en-GB"/>
+        </w:rPr>
+      </w:pPr>
+      <w:r>
+        <w:rPr>
+          <w:rFonts w:ascii="Arial" w:hAnsi="Arial" w:cs="Arial"/>
+          <w:sz w:val="28"/>
+          <w:szCs w:val="28"/>
+        </w:rPr>
+        <w:t>Z racji wykorzystania VirtualBox b</w:t>
+      </w:r>
+      <w:r>
+        <w:rPr>
+          <w:rFonts w:ascii="Arial" w:hAnsi="Arial" w:cs="Arial"/>
+          <w:sz w:val="28"/>
+          <w:szCs w:val="28"/>
+        </w:rPr>
+        <w:t xml:space="preserve">azowo maszyny wirtualne nie </w:t>
+      </w:r>
+      <w:r>
+        <w:rPr>
+          <w:rFonts w:ascii="Arial" w:hAnsi="Arial" w:cs="Arial"/>
+          <w:sz w:val="28"/>
+          <w:szCs w:val="28"/>
+        </w:rPr>
+        <w:t xml:space="preserve"> posiadały skonfigurowanych adresów co należało uczynić samemu. </w:t>
+      </w:r>
+      <w:r>
+        <w:rPr>
+          <w:rFonts w:ascii="Arial" w:hAnsi="Arial" w:cs="Arial"/>
+          <w:sz w:val="28"/>
+          <w:szCs w:val="28"/>
+          <w:lang w:val="en-GB"/>
+        </w:rPr>
+        <w:t>Przykładowe komendy konfigurujące routing</w:t>
+      </w:r>
+      <w:r>
+        <w:rPr>
+          <w:rFonts w:ascii="Arial" w:hAnsi="Arial" w:cs="Arial"/>
+          <w:sz w:val="28"/>
+          <w:szCs w:val="28"/>
+          <w:lang w:val="en-GB"/>
+        </w:rPr>
+        <w:t>:</w:t>
+      </w:r>
+      <w:r>
+        <w:rPr>
+          <w:rFonts w:ascii="Arial" w:hAnsi="Arial" w:cs="Arial"/>
+          <w:sz w:val="28"/>
+          <w:szCs w:val="28"/>
+          <w:lang w:val="en-GB"/>
+        </w:rPr>
+        <w:br/>
+      </w:r>
+      <w:r>
+        <w:rPr>
+          <w:rFonts w:ascii="Arial" w:hAnsi="Arial" w:cs="Arial"/>
+          <w:i/>
+          <w:iCs/>
+          <w:sz w:val="28"/>
+          <w:szCs w:val="28"/>
+          <w:lang w:val="en-GB"/>
+        </w:rPr>
+        <w:t xml:space="preserve">sudo ip link set enp0s3 up </w:t>
+      </w:r>
+      <w:r>
+        <w:rPr>
+          <w:rFonts w:ascii="Arial" w:hAnsi="Arial" w:cs="Arial"/>
+          <w:i/>
+          <w:iCs/>
+          <w:sz w:val="28"/>
+          <w:szCs w:val="28"/>
+          <w:lang w:val="en-GB"/>
+        </w:rPr>
+        <w:br/>
+      </w:r>
+      <w:r>
+        <w:rPr>
+          <w:rFonts w:ascii="Arial" w:hAnsi="Arial" w:cs="Arial"/>
+          <w:i/>
+          <w:iCs/>
+          <w:sz w:val="28"/>
+          <w:szCs w:val="28"/>
+          <w:lang w:val="en-GB"/>
+        </w:rPr>
+        <w:t xml:space="preserve">sudo ip addr add 192.168.100.100/24 dev enp0s3 </w:t>
+      </w:r>
+      <w:r>
+        <w:rPr>
+          <w:rFonts w:ascii="Arial" w:hAnsi="Arial" w:cs="Arial"/>
+          <w:i/>
+          <w:iCs/>
+          <w:sz w:val="28"/>
+          <w:szCs w:val="28"/>
+          <w:lang w:val="en-GB"/>
+        </w:rPr>
+        <w:br/>
+      </w:r>
+      <w:r>
+        <w:rPr>
+          <w:rFonts w:ascii="Arial" w:hAnsi="Arial" w:cs="Arial"/>
+          <w:i/>
+          <w:iCs/>
+          <w:sz w:val="28"/>
+          <w:szCs w:val="28"/>
+          <w:lang w:val="en-GB"/>
+        </w:rPr>
+        <w:t>sudo ip route add default via 192.168.100.1</w:t>
+      </w:r>
+    </w:p>
+    <w:p>
+      <w:pPr>
+        <w:rPr>
+          <w:rFonts w:ascii="Arial" w:hAnsi="Arial" w:cs="Arial"/>
+          <w:b/>
+          <w:bCs/>
+          <w:sz w:val="28"/>
+          <w:szCs w:val="28"/>
+        </w:rPr>
+      </w:pPr>
+      <w:r>
+        <w:rPr>
+          <w:rFonts w:ascii="Arial" w:hAnsi="Arial" w:cs="Arial"/>
+          <w:b/>
+          <w:bCs/>
+          <w:sz w:val="28"/>
+          <w:szCs w:val="28"/>
+        </w:rPr>
+        <w:t>Przykład</w:t>
+      </w:r>
+      <w:r>
+        <w:rPr>
+          <w:rFonts w:ascii="Arial" w:hAnsi="Arial" w:cs="Arial"/>
+          <w:b/>
+          <w:bCs/>
+          <w:sz w:val="28"/>
+          <w:szCs w:val="28"/>
+        </w:rPr>
+        <w:t>y</w:t>
+      </w:r>
+      <w:r>
+        <w:rPr>
+          <w:rFonts w:ascii="Arial" w:hAnsi="Arial" w:cs="Arial"/>
+          <w:b/>
+          <w:bCs/>
+          <w:sz w:val="28"/>
+          <w:szCs w:val="28"/>
+        </w:rPr>
+        <w:t xml:space="preserve"> komunikacji</w:t>
+      </w:r>
+      <w:r>
+        <w:rPr>
+          <w:rFonts w:ascii="Arial" w:hAnsi="Arial" w:cs="Arial"/>
+          <w:b/>
+          <w:bCs/>
+          <w:sz w:val="28"/>
+          <w:szCs w:val="28"/>
+        </w:rPr>
+        <w:t>:</w:t>
+      </w:r>
+    </w:p>
+    <w:p>
+      <w:pPr>
+        <w:rPr>
+          <w:rFonts w:ascii="Arial" w:hAnsi="Arial" w:cs="Arial"/>
+          <w:sz w:val="28"/>
+          <w:szCs w:val="28"/>
+        </w:rPr>
+      </w:pPr>
+      <w:r>
+        <w:rPr>
+          <w:rFonts w:ascii="Arial" w:hAnsi="Arial" w:cs="Arial"/>
+          <w:sz w:val="28"/>
+          <w:szCs w:val="28"/>
+        </w:rPr>
+        <w:t>-</w:t>
+      </w:r>
+      <w:r>
+        <w:rPr>
+          <w:rFonts w:ascii="Arial" w:hAnsi="Arial" w:cs="Arial"/>
+          <w:sz w:val="28"/>
+          <w:szCs w:val="28"/>
+        </w:rPr>
+        <w:t xml:space="preserve"> </w:t>
+      </w:r>
+      <w:r>
+        <w:rPr>
+          <w:rFonts w:ascii="Arial" w:hAnsi="Arial" w:cs="Arial"/>
+          <w:sz w:val="28"/>
+          <w:szCs w:val="28"/>
+        </w:rPr>
+        <w:t>ping</w:t>
+      </w:r>
+      <w:r>
+        <w:rPr>
+          <w:rFonts w:ascii="Arial" w:hAnsi="Arial" w:cs="Arial"/>
+          <w:sz w:val="28"/>
+          <w:szCs w:val="28"/>
+        </w:rPr>
+        <w:t xml:space="preserve"> VyOS &lt;-&gt; Serwer 1</w:t>
+      </w:r>
+    </w:p>
+    <w:p>
+      <w:pPr>
+        <w:rPr>
+          <w:rFonts w:ascii="Arial" w:hAnsi="Arial" w:cs="Arial"/>
+          <w:sz w:val="28"/>
+          <w:szCs w:val="28"/>
+        </w:rPr>
+      </w:pPr>
+      <w:r>
+        <w:rPr>
+          <w:rFonts w:ascii="Arial" w:hAnsi="Arial" w:cs="Arial"/>
+          <w:noProof/>
+          <w:sz w:val="28"/>
+          <w:szCs w:val="28"/>
+        </w:rPr>
+        <w:drawing>
+          <wp:inline distT="0" distB="0" distL="0" distR="0" wp14:anchorId="709F1231" wp14:editId="3A3DB16C">
+            <wp:extent cx="5760720" cy="3425190"/>
+            <wp:effectExtent l="0" t="0" r="0" b="3810"/>
+            <wp:docPr id="445168093" name="Obraz 1"/>
+            <wp:cNvGraphicFramePr>
+              <a:graphicFrameLocks xmlns:a="http://schemas.openxmlformats.org/drawingml/2006/main" noChangeAspect="1"/>
+            </wp:cNvGraphicFramePr>
+            <a:graphic xmlns:a="http://schemas.openxmlformats.org/drawingml/2006/main">
+              <a:graphicData uri="http://schemas.openxmlformats.org/drawingml/2006/picture">
+                <pic:pic xmlns:pic="http://schemas.openxmlformats.org/drawingml/2006/picture">
+                  <pic:nvPicPr>
+                    <pic:cNvPr id="445168093" name=""/>
+                    <pic:cNvPicPr/>
+                  </pic:nvPicPr>
+                  <pic:blipFill>
+                    <a:blip r:embed="rId7"/>
+                    <a:stretch>
+                      <a:fillRect/>
+                    </a:stretch>
+                  </pic:blipFill>
+                  <pic:spPr>
+                    <a:xfrm>
+                      <a:off x="0" y="0"/>
+                      <a:ext cx="5760720" cy="3425190"/>
+                    </a:xfrm>
+                    <a:prstGeom prst="rect">
+                      <a:avLst/>
+                    </a:prstGeom>
+                  </pic:spPr>
+                </pic:pic>
+              </a:graphicData>
+            </a:graphic>
+          </wp:inline>
+        </w:drawing>
+      </w:r>
+    </w:p>
+    <w:p>
+      <w:pPr>
+        <w:rPr>
+          <w:rFonts w:ascii="Arial" w:hAnsi="Arial" w:cs="Arial"/>
+          <w:b/>
+          <w:bCs/>
+          <w:sz w:val="28"/>
+          <w:szCs w:val="28"/>
+        </w:rPr>
+      </w:pPr>
+      <w:r>
+        <w:rPr>
+          <w:rFonts w:ascii="Arial" w:hAnsi="Arial" w:cs="Arial"/>
+          <w:sz w:val="28"/>
+          <w:szCs w:val="28"/>
+        </w:rPr>
+        <w:t xml:space="preserve">- nslookup </w:t>
+      </w:r>
+      <w:r>
+        <w:rPr>
+          <w:rFonts w:ascii="Arial" w:hAnsi="Arial" w:cs="Arial"/>
+          <w:sz w:val="28"/>
+          <w:szCs w:val="28"/>
+        </w:rPr>
+        <w:t>na domenę</w:t>
+      </w:r>
+      <w:r>
+        <w:rPr>
+          <w:rFonts w:ascii="Arial" w:hAnsi="Arial" w:cs="Arial"/>
+          <w:sz w:val="28"/>
+          <w:szCs w:val="28"/>
+        </w:rPr>
+        <w:t xml:space="preserve"> </w:t>
+      </w:r>
+      <w:r>
+        <w:rPr>
+          <w:rFonts w:ascii="Arial" w:hAnsi="Arial" w:cs="Arial"/>
+          <w:sz w:val="28"/>
+          <w:szCs w:val="28"/>
+        </w:rPr>
+        <w:t>ex.com</w:t>
+      </w:r>
+      <w:r>
+        <w:rPr>
+          <w:rFonts w:ascii="Arial" w:hAnsi="Arial" w:cs="Arial"/>
+          <w:sz w:val="28"/>
+          <w:szCs w:val="28"/>
+        </w:rPr>
+        <w:br/>
+      </w:r>
+      <w:r>
+        <w:rPr>
+          <w:rFonts w:ascii="Arial" w:hAnsi="Arial" w:cs="Arial"/>
+          <w:b/>
+          <w:bCs/>
+          <w:noProof/>
+          <w:sz w:val="28"/>
+          <w:szCs w:val="28"/>
+          <w:lang w:val="en-GB"/>
+        </w:rPr>
+        <w:drawing>
+          <wp:inline distT="0" distB="0" distL="0" distR="0" wp14:anchorId="2FFC503B" wp14:editId="7D9EAB64">
+            <wp:extent cx="3391194" cy="914479"/>
+            <wp:effectExtent l="0" t="0" r="0" b="0"/>
+            <wp:docPr id="1067190912" name="Obraz 1"/>
+            <wp:cNvGraphicFramePr>
+              <a:graphicFrameLocks xmlns:a="http://schemas.openxmlformats.org/drawingml/2006/main" noChangeAspect="1"/>
+            </wp:cNvGraphicFramePr>
+            <a:graphic xmlns:a="http://schemas.openxmlformats.org/drawingml/2006/main">
+              <a:graphicData uri="http://schemas.openxmlformats.org/drawingml/2006/picture">
+                <pic:pic xmlns:pic="http://schemas.openxmlformats.org/drawingml/2006/picture">
+                  <pic:nvPicPr>
+                    <pic:cNvPr id="1067190912" name=""/>
+                    <pic:cNvPicPr/>
+                  </pic:nvPicPr>
+                  <pic:blipFill>
+                    <a:blip r:embed="rId8"/>
+                    <a:stretch>
+                      <a:fillRect/>
+                    </a:stretch>
+                  </pic:blipFill>
+                  <pic:spPr>
+                    <a:xfrm>
+                      <a:off x="0" y="0"/>
+                      <a:ext cx="3391194" cy="914479"/>
+                    </a:xfrm>
+                    <a:prstGeom prst="rect">
+                      <a:avLst/>
+                    </a:prstGeom>
+                  </pic:spPr>
+                </pic:pic>
+              </a:graphicData>
+            </a:graphic>
+          </wp:inline>
+        </w:drawing>
+      </w:r>
+    </w:p>
+    <w:p>
+      <w:pPr>
+        <w:rPr>
+          <w:rFonts w:ascii="Arial" w:hAnsi="Arial" w:cs="Arial"/>
+          <w:sz w:val="28"/>
+          <w:szCs w:val="28"/>
+        </w:rPr>
+      </w:pPr>
     </w:p>
     <w:p>
       <w:pPr>
@@ -1610,7 +2124,6 @@
   <w:style w:type="character" w:default="1" w:styleId="Domylnaczcionkaakapitu">
     <w:name w:val="Default Paragraph Font"/>
     <w:uiPriority w:val="1"/>
-    <w:semiHidden/>
     <w:unhideWhenUsed/>
   </w:style>
   <w:style w:type="table" w:default="1" w:styleId="Standardowy">

</xml_diff>